<commit_message>
Add Day 02 (remote access, files, desktop, more than one network)
- Tutorial (23 pages) and notebook-style notes (20 pages), both stand-alone,
  covering Pi 4 and Pi 5: SSH config nicknames, SSH keys, tmux, scp and SFTP,
  git sync, VNC, second Wi-Fi with nmcli, finding a Pi, remote-access options,
  security habits, troubleshooting, quiz, glossary, references
- Narrated animation (65 s) with subtitles and narration script
- Pi 4 language-model wording corrected in Day 1 and the roadmap
  (a Pi 4 does not run language models well; use a Pi 5 for Phase 3)
- README progress and build instructions updated

Co-Authored-By: Claude Sonnet 5.5 <noreply@anthropic.com>
Claude-Session: https://claude.ai/code/session_01TKpiyDgkRVMDW5GqKtQ3Pe
</commit_message>
<xml_diff>
--- a/tutorials/00_roadmap/Roadmap_Edge_AI_with_Raspberry_Pi.docx
+++ b/tutorials/00_roadmap/Roadmap_Edge_AI_with_Raspberry_Pi.docx
@@ -1503,13 +1503,39 @@
                 <w:b/>
                 <w:sz w:val="19"/>
               </w:rPr>
-              <w:t>Pi 4 and Pi 5 speed and memory:</w:t>
+              <w:t>Pi 4 and Pi 5:</w:t>
             </w:r>
             <w:r>
               <w:rPr>
                 <w:sz w:val="19"/>
               </w:rPr>
-              <w:t xml:space="preserve"> the vision phase runs well on both. In the language-model phase a Pi 5 (8 GB is best) runs larger models; a Pi 4 uses smaller models and longer waits. Each lesson recommends a model size per board.</w:t>
+              <w:t xml:space="preserve"> the vision phases run well on both. A </w:t>
+            </w:r>
+            <w:r>
+              <w:rPr>
+                <w:b/>
+                <w:sz w:val="19"/>
+              </w:rPr>
+              <w:t>Pi 4 does not run language models well</w:t>
+            </w:r>
+            <w:r>
+              <w:rPr>
+                <w:sz w:val="19"/>
+              </w:rPr>
+              <w:t xml:space="preserve"> (only very small models, slowly), so Phase 3 is best done on a </w:t>
+            </w:r>
+            <w:r>
+              <w:rPr>
+                <w:b/>
+                <w:sz w:val="19"/>
+              </w:rPr>
+              <w:t>Pi 5 (8 GB recommended)</w:t>
+            </w:r>
+            <w:r>
+              <w:rPr>
+                <w:sz w:val="19"/>
+              </w:rPr>
+              <w:t>. With only a Pi 4 you still complete the course and treat Phase 3 as a guided demonstration with the smallest models.</w:t>
             </w:r>
           </w:p>
           <w:p>
@@ -6702,7 +6728,7 @@
                 <w:b w:val="0"/>
                 <w:sz w:val="17"/>
               </w:rPr>
-              <w:t>Install Ollama; choose a model that fits your board; chat</w:t>
+              <w:t>Install Ollama; choose a model that fits your board (Pi 5 recommended); chat</w:t>
             </w:r>
           </w:p>
         </w:tc>

</xml_diff>